<commit_message>
Restructure delegation governance and record SML relocation and Probe 1 preparation
</commit_message>
<xml_diff>
--- a/ROADMAP.docx
+++ b/ROADMAP.docx
@@ -338,11 +338,223 @@
           </w:p>
         </w:tc>
       </w:tr>
+      <w:tr>
+        <w:trPr>
+          <w:cantSplit/>
+        </w:trPr>
+        <w:tc>
+          <w:tcPr>
+            <w:tcW w:type="dxa" w:w="4248"/>
+            <w:vAlign w:val="center"/>
+            <w:tcMar>
+              <w:top w:w="100" w:type="dxa"/>
+              <w:bottom w:w="100" w:type="dxa"/>
+              <w:left w:w="110" w:type="dxa"/>
+              <w:right w:w="110" w:type="dxa"/>
+            </w:tcMar>
+          </w:tcPr>
+          <w:p>
+            <w:pPr>
+              <w:spacing w:after="40" w:line="240" w:lineRule="auto"/>
+            </w:pPr>
+            <w:r>
+              <w:rPr>
+                <w:b w:val="0"/>
+                <w:sz w:val="21"/>
+              </w:rPr>
+              <w:t>CHANGELOG.md</w:t>
+            </w:r>
+          </w:p>
+        </w:tc>
+        <w:tc>
+          <w:tcPr>
+            <w:tcW w:type="dxa" w:w="5832"/>
+            <w:vAlign w:val="center"/>
+            <w:tcMar>
+              <w:top w:w="100" w:type="dxa"/>
+              <w:bottom w:w="100" w:type="dxa"/>
+              <w:left w:w="110" w:type="dxa"/>
+              <w:right w:w="110" w:type="dxa"/>
+            </w:tcMar>
+          </w:tcPr>
+          <w:p>
+            <w:pPr>
+              <w:spacing w:after="40" w:line="240" w:lineRule="auto"/>
+            </w:pPr>
+            <w:r>
+              <w:rPr>
+                <w:b w:val="0"/>
+                <w:sz w:val="21"/>
+              </w:rPr>
+              <w:t>meaningful project, design, and implementation history</w:t>
+            </w:r>
+          </w:p>
+        </w:tc>
+      </w:tr>
+      <w:tr>
+        <w:trPr>
+          <w:cantSplit/>
+        </w:trPr>
+        <w:tc>
+          <w:tcPr>
+            <w:tcW w:type="dxa" w:w="4248"/>
+            <w:vAlign w:val="center"/>
+            <w:tcMar>
+              <w:top w:w="100" w:type="dxa"/>
+              <w:bottom w:w="100" w:type="dxa"/>
+              <w:left w:w="110" w:type="dxa"/>
+              <w:right w:w="110" w:type="dxa"/>
+            </w:tcMar>
+          </w:tcPr>
+          <w:p>
+            <w:pPr>
+              <w:spacing w:after="40" w:line="240" w:lineRule="auto"/>
+            </w:pPr>
+            <w:r>
+              <w:rPr>
+                <w:b w:val="0"/>
+                <w:sz w:val="21"/>
+              </w:rPr>
+              <w:t>WORKFLOW.md</w:t>
+            </w:r>
+          </w:p>
+        </w:tc>
+        <w:tc>
+          <w:tcPr>
+            <w:tcW w:type="dxa" w:w="5832"/>
+            <w:vAlign w:val="center"/>
+            <w:tcMar>
+              <w:top w:w="100" w:type="dxa"/>
+              <w:bottom w:w="100" w:type="dxa"/>
+              <w:left w:w="110" w:type="dxa"/>
+              <w:right w:w="110" w:type="dxa"/>
+            </w:tcMar>
+          </w:tcPr>
+          <w:p>
+            <w:pPr>
+              <w:spacing w:after="40" w:line="240" w:lineRule="auto"/>
+            </w:pPr>
+            <w:r>
+              <w:rPr>
+                <w:b w:val="0"/>
+                <w:sz w:val="21"/>
+              </w:rPr>
+              <w:t>coordination and change discipline</w:t>
+            </w:r>
+          </w:p>
+        </w:tc>
+      </w:tr>
+      <w:tr>
+        <w:trPr>
+          <w:cantSplit/>
+        </w:trPr>
+        <w:tc>
+          <w:tcPr>
+            <w:tcW w:type="dxa" w:w="4248"/>
+            <w:vAlign w:val="center"/>
+            <w:tcMar>
+              <w:top w:w="100" w:type="dxa"/>
+              <w:bottom w:w="100" w:type="dxa"/>
+              <w:left w:w="110" w:type="dxa"/>
+              <w:right w:w="110" w:type="dxa"/>
+            </w:tcMar>
+          </w:tcPr>
+          <w:p>
+            <w:pPr>
+              <w:spacing w:after="40" w:line="240" w:lineRule="auto"/>
+            </w:pPr>
+            <w:r>
+              <w:rPr>
+                <w:b w:val="0"/>
+                <w:sz w:val="21"/>
+              </w:rPr>
+              <w:t>Development/SPECIALIST_DELEGATION.md</w:t>
+            </w:r>
+          </w:p>
+        </w:tc>
+        <w:tc>
+          <w:tcPr>
+            <w:tcW w:type="dxa" w:w="5832"/>
+            <w:vAlign w:val="center"/>
+            <w:tcMar>
+              <w:top w:w="100" w:type="dxa"/>
+              <w:bottom w:w="100" w:type="dxa"/>
+              <w:left w:w="110" w:type="dxa"/>
+              <w:right w:w="110" w:type="dxa"/>
+            </w:tcMar>
+          </w:tcPr>
+          <w:p>
+            <w:pPr>
+              <w:spacing w:after="40" w:line="240" w:lineRule="auto"/>
+            </w:pPr>
+            <w:r>
+              <w:rPr>
+                <w:b w:val="0"/>
+                <w:sz w:val="21"/>
+              </w:rPr>
+              <w:t>detailed specialist selection, model/effort, task, handoff, and verification rules</w:t>
+            </w:r>
+          </w:p>
+        </w:tc>
+      </w:tr>
+      <w:tr>
+        <w:trPr>
+          <w:cantSplit/>
+        </w:trPr>
+        <w:tc>
+          <w:tcPr>
+            <w:tcW w:type="dxa" w:w="4248"/>
+            <w:vAlign w:val="center"/>
+            <w:tcMar>
+              <w:top w:w="100" w:type="dxa"/>
+              <w:bottom w:w="100" w:type="dxa"/>
+              <w:left w:w="110" w:type="dxa"/>
+              <w:right w:w="110" w:type="dxa"/>
+            </w:tcMar>
+          </w:tcPr>
+          <w:p>
+            <w:pPr>
+              <w:spacing w:after="40" w:line="240" w:lineRule="auto"/>
+            </w:pPr>
+            <w:r>
+              <w:rPr>
+                <w:b w:val="0"/>
+                <w:sz w:val="21"/>
+              </w:rPr>
+              <w:t>CLAUDE.md</w:t>
+            </w:r>
+          </w:p>
+        </w:tc>
+        <w:tc>
+          <w:tcPr>
+            <w:tcW w:type="dxa" w:w="5832"/>
+            <w:vAlign w:val="center"/>
+            <w:tcMar>
+              <w:top w:w="100" w:type="dxa"/>
+              <w:bottom w:w="100" w:type="dxa"/>
+              <w:left w:w="110" w:type="dxa"/>
+              <w:right w:w="110" w:type="dxa"/>
+            </w:tcMar>
+          </w:tcPr>
+          <w:p>
+            <w:pPr>
+              <w:spacing w:after="40" w:line="240" w:lineRule="auto"/>
+            </w:pPr>
+            <w:r>
+              <w:rPr>
+                <w:b w:val="0"/>
+                <w:sz w:val="21"/>
+              </w:rPr>
+              <w:t>Claude-specific implementation rules</w:t>
+            </w:r>
+          </w:p>
+        </w:tc>
+      </w:tr>
     </w:tbl>
     <w:p/>
     <w:p>
       <w:r>
-        <w:t>CHANGELOG.md, CLAUDE.md and WORKFLOW.md retain their existing history, implementation-guidance and coordination roles. ROADMAP.docx stays outside that authority chain. Use Word’s Navigation Pane and built-in headings to navigate or collapse sections.</w:t>
+        <w:t>WORKFLOW.md explains coordination and change discipline; Development/SPECIALIST_DELEGATION.md contains detailed delegation and verification rules; CLAUDE.md retains implementation guidance. ROADMAP.docx stays outside the authority chain. Use Word’s Navigation Pane and built-in headings to navigate or collapse sections.</w:t>
       </w:r>
     </w:p>
     <w:p>
@@ -368,12 +580,12 @@
     </w:p>
     <w:p>
       <w:r>
-        <w:t>The recorded target is Satisfactory 1.2 with SML 3.12.0 / 3.12.x and Coffee Stain Unreal Engine 5.6.1-CSS. Visual Studio project generation succeeded. FactoryGame Development Editor / Win64 built successfully on 20 September: 12 succeeded and 0 failed. The editor opened and loaded FactoryGame/SML on 26 September, and SML 3.12.0 initialized.</w:t>
+        <w:t>The recorded target is Satisfactory 1.2 with SML 3.12.0 / 3.12.x and Coffee Stain Unreal Engine 5.6.1-CSS. Visual Studio project generation succeeded. FactoryGame Development Editor / Win64 built successfully on 20 September: 12 succeeded and 0 failed. The editor opened and loaded FactoryGame/SML on 26 September, and SML 3.12.0 initialized. At C:\SML on 2 October, project regeneration and Development Editor / Win64 build succeeded (488.10 seconds); the editor/probe Blueprint loaded successfully.</w:t>
       </w:r>
     </w:p>
     <w:p>
       <w:r>
-        <w:t>Wwise integration is functioning after enabling Object GUID, Object Path, Max Attenuation and Estimated Duration metadata and regenerating SoundBanks. The remaining all-banks metadata efficiency message is advisory. Turnkey’s System.Windows.Forms assembly issue remains unresolved and deferred; it has not blocked generation, build or editor launch.</w:t>
+        <w:t>Wwise integration is functioning after enabling Object GUID, Object Path, Max Attenuation and Estimated Duration metadata and regenerating SoundBanks. The remaining all-banks metadata efficiency message is advisory. Turnkey’s System.Windows.Forms assembly issue remains unresolved and deferred; it has not blocked generation, build or editor launch. Wwise survived relocation and reported UpdateDataStructure: Done. The shorter workspace removed UBT's 260-character Shipping path blocker. Probe-only Windows Shipping packaging/deployment succeeded (ExitCode 0; about 6 minutes 41 seconds), with both server targets and game launch disabled.</w:t>
       </w:r>
     </w:p>
     <w:p>
@@ -386,7 +598,7 @@
     </w:p>
     <w:p>
       <w:r>
-        <w:t>No Early Locomotion gameplay plugin/prototype exists yet. Read-only railway header/API reconnaissance is complete, but local Private .cpp implementations are generated stubs. Architecture, runtime traction behaviour, gameplay implementation, packaging and in-game operation remain unverified. Blender blockout/reference work is supporting asset preparation, not proof of a playable railway.</w:t>
+        <w:t>The temporary non-production EL_ArchitectureProbe implementation and Blueprint configuration exist. Its editor module and Blueprint load, and Windows Shipping packaging/deployment succeeded. Runtime Probe 1 behaviour, production gameplay implementation and in-game operation remain unverified; architecture is unresolved. Local Private .cpp implementations are generated stubs. Blender prototypes remain supporting asset preparation.</w:t>
       </w:r>
     </w:p>
     <w:p>
@@ -399,7 +611,7 @@
     </w:p>
     <w:p>
       <w:r>
-        <w:t>Runtime Baseline Experiment 1 is scoped but unrun. In vanilla/SML-only retail Satisfactory, use a station to power approximately 200 m of straight track and one Electric Locomotive. First confirm powered acceleration from rest. Then stop, cut rail/station power, re-enter and apply the same forward input.</w:t>
+        <w:t>Run the prepared Runtime Probe 1 in retail Satisfactory using the Manager-approved procedure. The probe is packaged and deployed; Alpakit did not launch retail Satisfactory. Its runtime outcome remains pending.</w:t>
       </w:r>
     </w:p>
     <w:p>
@@ -407,7 +619,7 @@
         <w:pStyle w:val="ListBullet"/>
       </w:pPr>
       <w:r>
-        <w:t>Record movement, visible throttle/input response, any no-power indication and whether the locomotive UI/menu still functions.</w:t>
+        <w:t>Record probe observations and return them to The Manager. Successful build, editor loading and packaging do not prove runtime traction behaviour.</w:t>
       </w:r>
     </w:p>
     <w:p>
@@ -415,12 +627,12 @@
         <w:pStyle w:val="ListBullet"/>
       </w:pPr>
       <w:r>
-        <w:t>Do not yet run moving power-loss, slopes/gravity, timetable/autopilot, brownout/fuse, a logging mod or Experiment 2 track-connectivity tests.</w:t>
+        <w:t>Do not expand probe scope or choose locomotive/track architecture without Manager review of runtime evidence.</w:t>
       </w:r>
     </w:p>
     <w:p>
       <w:r>
-        <w:t>Return the observations to The Manager before expanding the experiment or selecting architecture. Header declarations do not establish runtime behaviour.</w:t>
+        <w:t>The earlier vanilla baseline plan is preserved in the historical progress log; no runtime success or failure is recorded here.</w:t>
       </w:r>
     </w:p>
     <w:p>
@@ -433,7 +645,7 @@
     </w:p>
     <w:p>
       <w:r>
-        <w:t>Canonical project/docs: C:\Users\a156b\Documents\Satisfactory - Early Locomotion. SML/implementation workspace: C:\Users\a156b\Documents\SatisfactoryModding\SatisfactoryModLoader. Keep documentation authority separate from the implementation workspace.</w:t>
+        <w:t>Canonical project/docs: C:\Users\a156b\Documents\Satisfactory - Early Locomotion. Active SML/implementation workspace: C:\SML. Keep documentation authority separate from the implementation workspace; the relocation safety backup is temporary recovery material.</w:t>
       </w:r>
     </w:p>
     <w:p>
@@ -1521,7 +1733,7 @@
                 <w:b w:val="0"/>
                 <w:sz w:val="21"/>
               </w:rPr>
-              <w:t>Current next work: Experiment 1, then evidence-led assessment; architecture unresolved</w:t>
+              <w:t>Current next work: prepared/deployed runtime Probe 1, then evidence-led architecture assessment; outcome and architecture unresolved</w:t>
             </w:r>
           </w:p>
         </w:tc>

</xml_diff>

<commit_message>
Record successful Runtime Probe 1 and move to causality controls
</commit_message>
<xml_diff>
--- a/ROADMAP.docx
+++ b/ROADMAP.docx
@@ -593,12 +593,12 @@
         <w:pStyle w:val="Heading2"/>
       </w:pPr>
       <w:r>
-        <w:t>What has not been proved</w:t>
+        <w:t>Runtime result and remaining limits</w:t>
       </w:r>
     </w:p>
     <w:p>
       <w:r>
-        <w:t>The temporary non-production EL_ArchitectureProbe implementation and Blueprint configuration exist. Its editor module and Blueprint load, and Windows Shipping packaging/deployment succeeded. Runtime Probe 1 behaviour, production gameplay implementation and in-game operation remain unverified; architecture is unresolved. Local Private .cpp implementations are generated stubs. Blender prototypes remain supporting asset preparation.</w:t>
+        <w:t>Retail Runtime Probe 1 is completed and analysed from observation and FactoryGame.log. Two separately placed probes verified AFGLocomotive subclass construction, vanilla rail attachment, input, braking and movement from rest with HasPower=false. Final architecture and production gameplay remain unresolved.</w:t>
       </w:r>
     </w:p>
     <w:p>
@@ -611,7 +611,7 @@
     </w:p>
     <w:p>
       <w:r>
-        <w:t>Run the prepared Runtime Probe 1 in retail Satisfactory using the Manager-approved procedure. The probe is packaged and deployed; Alpakit did not launch retail Satisfactory. Its runtime outcome remains pending.</w:t>
+        <w:t>Run causality control tests on the same dead track: vanilla unpowered movement, no-op UpdatePower alone, and necessity of SetTractivePowerFactor(1.f). Its specific causal contribution is not yet proved.</w:t>
       </w:r>
     </w:p>
     <w:p>
@@ -619,7 +619,7 @@
         <w:pStyle w:val="ListBullet"/>
       </w:pPr>
       <w:r>
-        <w:t>Record probe observations and return them to The Manager. Successful build, editor loading and packaging do not prove runtime traction behaviour.</w:t>
+        <w:t>Return control observations and log evidence to The Manager before final architecture selection. Probe 1 retained train membership and the locomotive movement component; air and dynamic braking stopped it.</w:t>
       </w:r>
     </w:p>
     <w:p>
@@ -627,12 +627,12 @@
         <w:pStyle w:val="ListBullet"/>
       </w:pPr>
       <w:r>
-        <w:t>Do not expand probe scope or choose locomotive/track architecture without Manager review of runtime evidence.</w:t>
+        <w:t>Camera rotation, normal locomotive UI and exit placement remain residuals; they do not currently invalidate the traction and rail integration result.</w:t>
       </w:r>
     </w:p>
     <w:p>
       <w:r>
-        <w:t>The earlier vanilla baseline plan is preserved in the historical progress log; no runtime success or failure is recorded here.</w:t>
+        <w:t>Probe 1 completion does not verify coupling, track connectivity, station/platform behaviour, timetables, save/load or multiplayer. Historical baseline plans remain in the progress log.</w:t>
       </w:r>
     </w:p>
     <w:p>
@@ -1733,7 +1733,7 @@
                 <w:b w:val="0"/>
                 <w:sz w:val="21"/>
               </w:rPr>
-              <w:t>Current next work: prepared/deployed runtime Probe 1, then evidence-led architecture assessment; outcome and architecture unresolved</w:t>
+              <w:t>Probe 1 completed: construction, rail attachment, input, braking and unpowered movement verified; causality controls next; final architecture unresolved</w:t>
             </w:r>
           </w:p>
         </w:tc>

</xml_diff>

<commit_message>
Record Probe 1 traction causality and next coupling tests
</commit_message>
<xml_diff>
--- a/ROADMAP.docx
+++ b/ROADMAP.docx
@@ -611,7 +611,7 @@
     </w:p>
     <w:p>
       <w:r>
-        <w:t>Run causality control tests on the same dead track: vanilla unpowered movement, no-op UpdatePower alone, and necessity of SetTractivePowerFactor(1.f). Its specific causal contribution is not yet proved.</w:t>
+        <w:t>Restore the successful working probe with SetTractivePowerFactor(1.f) active and UpdatePower() remaining a no-op, then begin normal railway integration with vanilla wagon coupling. Restoration and coupling testing are not yet completed.</w:t>
       </w:r>
     </w:p>
     <w:p>
@@ -619,7 +619,7 @@
         <w:pStyle w:val="ListBullet"/>
       </w:pPr>
       <w:r>
-        <w:t>Return control observations and log evidence to The Manager before final architecture selection. Probe 1 retained train membership and the locomotive movement component; air and dynamic braking stopped it.</w:t>
+        <w:t>Three-way control completed: vanilla did not move; the working EL probe moved without power; disabling only SetTractivePowerFactor left force and speed at zero despite input and released air brake (165 samples).</w:t>
       </w:r>
     </w:p>
     <w:p>
@@ -632,7 +632,7 @@
     </w:p>
     <w:p>
       <w:r>
-        <w:t>Probe 1 completion does not verify coupling, track connectivity, station/platform behaviour, timetables, save/load or multiplayer. Historical baseline plans remain in the progress log.</w:t>
+        <w:t>Within the tested implementation, SetTractivePowerFactor(1.f) is necessary for unpowered traction; no-op UpdatePower alone is insufficient. This does not select final architecture or verify coupling, stations, timetables, save/load or multiplayer.</w:t>
       </w:r>
     </w:p>
     <w:p>
@@ -1733,7 +1733,7 @@
                 <w:b w:val="0"/>
                 <w:sz w:val="21"/>
               </w:rPr>
-              <w:t>Probe 1 completed: construction, rail attachment, input, braking and unpowered movement verified; causality controls next; final architecture unresolved</w:t>
+              <w:t>Probe 1 and traction-causality control completed; restore working probe, then test vanilla wagon coupling; final production architecture unresolved</w:t>
             </w:r>
           </w:p>
         </w:tc>

</xml_diff>

<commit_message>
Record Probe 1 vanilla wagon integration and next station tests
</commit_message>
<xml_diff>
--- a/ROADMAP.docx
+++ b/ROADMAP.docx
@@ -598,7 +598,7 @@
     </w:p>
     <w:p>
       <w:r>
-        <w:t>Retail Runtime Probe 1 is completed and analysed from observation and FactoryGame.log. Two separately placed probes verified AFGLocomotive subclass construction, vanilla rail attachment, input, braking and movement from rest with HasPower=false. Final architecture and production gameplay remain unresolved.</w:t>
+        <w:t>Runtime Probe 1 and traction-causality controls are complete. The restored AFGLocomotive-derived probe also formed a usable vanilla Freight Wagon consist during construction, moved forward/reverse and braked cleanly on unpowered railway, without observed derailment or separation. Final production architecture remains unresolved.</w:t>
       </w:r>
     </w:p>
     <w:p>
@@ -611,7 +611,7 @@
     </w:p>
     <w:p>
       <w:r>
-        <w:t>Restore the successful working probe with SetTractivePowerFactor(1.f) active and UpdatePower() remaining a no-op, then begin normal railway integration with vanilla wagon coupling. Restoration and coupling testing are not yet completed.</w:t>
+        <w:t>Proceed to station/timetable integration testing using the restored working probe. Record observations before final architecture selection; station/timetable success is not yet verified.</w:t>
       </w:r>
     </w:p>
     <w:p>
@@ -619,7 +619,7 @@
         <w:pStyle w:val="ListBullet"/>
       </w:pPr>
       <w:r>
-        <w:t>Three-way control completed: vanilla did not move; the working EL probe moved without power; disabling only SetTractivePowerFactor left force and speed at zero despite input and released air brake (165 samples).</w:t>
+        <w:t>Within the tested implementation, SetTractivePowerFactor(1.f) is necessary for unpowered traction; no-op UpdatePower alone is insufficient. Construction-time wagon integration is now verified.</w:t>
       </w:r>
     </w:p>
     <w:p>
@@ -627,12 +627,12 @@
         <w:pStyle w:val="ListBullet"/>
       </w:pPr>
       <w:r>
-        <w:t>Camera rotation, normal locomotive UI and exit placement remain residuals; they do not currently invalidate the traction and rail integration result.</w:t>
+        <w:t>Coupling-node alignment and camera/UI/exit residuals remain. Hitting an independently placed loose wagon made commands unresponsive; vanilla workflow support is unestablished, so no architecture failure is inferred.</w:t>
       </w:r>
     </w:p>
     <w:p>
       <w:r>
-        <w:t>Within the tested implementation, SetTractivePowerFactor(1.f) is necessary for unpowered traction; no-op UpdatePower alone is insufficient. This does not select final architecture or verify coupling, stations, timetables, save/load or multiplayer.</w:t>
+        <w:t>The verified result covers normal construction-time consist formation and movement/braking, not every coupling method. Stations, timetables, save/load and multiplayer remain unverified.</w:t>
       </w:r>
     </w:p>
     <w:p>
@@ -1733,7 +1733,7 @@
                 <w:b w:val="0"/>
                 <w:sz w:val="21"/>
               </w:rPr>
-              <w:t>Probe 1 and traction-causality control completed; restore working probe, then test vanilla wagon coupling; final production architecture unresolved</w:t>
+              <w:t>Probe 1, traction controls and normal vanilla wagon consist integration verified; station/timetable tests next; final architecture unresolved</w:t>
             </w:r>
           </w:p>
         </w:tc>

</xml_diff>

<commit_message>
Record Probe 2a power diagnostics and next self-driving control
</commit_message>
<xml_diff>
--- a/ROADMAP.docx
+++ b/ROADMAP.docx
@@ -25,7 +25,7 @@
     </w:p>
     <w:p>
       <w:r>
-        <w:t>Maintained from canonical project information • 2 October 2026</w:t>
+        <w:t>Maintained from canonical project information • 3 October 2026</w:t>
       </w:r>
     </w:p>
     <w:p>
@@ -598,7 +598,7 @@
     </w:p>
     <w:p>
       <w:r>
-        <w:t>Runtime Probe 1 and traction-causality controls are complete. The restored AFGLocomotive-derived probe also formed a usable vanilla Freight Wagon consist during construction, moved forward/reverse and braked cleanly on unpowered railway, without observed derailment or separation. Final production architecture remains unresolved.</w:t>
+        <w:t>Probe 1 traction controls and construction-time vanilla Freight Wagon forward/reverse movement and braking are verified. Probe 2a logged both locomotive power flags false on 1,069 samples: powered shoe contact allowed manual traction, but self-driving reported SDLE_NoPower and held the train stationary. Disabling self-driving restored manual traction.</w:t>
       </w:r>
     </w:p>
     <w:p>
@@ -611,7 +611,7 @@
     </w:p>
     <w:p>
       <w:r>
-        <w:t>Proceed to station/timetable integration testing using the restored working probe. Record observations before final architecture selection; station/timetable success is not yet verified.</w:t>
+        <w:t>Probe 2b: set only inherited locomotive mHasPower true through verified Unreal property reflection, leave PowerInfoHasPower unchanged, then test self-driving. This is a planned test, not a verified outcome.</w:t>
       </w:r>
     </w:p>
     <w:p>
@@ -619,7 +619,7 @@
         <w:pStyle w:val="ListBullet"/>
       </w:pPr>
       <w:r>
-        <w:t>Within the tested implementation, SetTractivePowerFactor(1.f) is necessary for unpowered traction; no-op UpdatePower alone is insufficient. Construction-time wagon integration is now verified.</w:t>
+        <w:t>The No Power condition is locomotive-level, not simply missing powered third rail. The exact gate remains unresolved because HasPower and PowerInfoHasPower were always identical in Probe 2a.</w:t>
       </w:r>
     </w:p>
     <w:p>
@@ -627,12 +627,12 @@
         <w:pStyle w:val="ListBullet"/>
       </w:pPr>
       <w:r>
-        <w:t>Coupling-node alignment and camera/UI/exit residuals remain. Hitting an independently placed loose wagon made commands unresponsive; vanilla workflow support is unestablished, so no architecture failure is inferred.</w:t>
+        <w:t>The earlier powering-related manual-drive failure did not reproduce and remains unverified. Coupling alignment, loose-wagon workflow support and camera/UI/exit residuals remain unresolved.</w:t>
       </w:r>
     </w:p>
     <w:p>
       <w:r>
-        <w:t>The verified result covers normal construction-time consist formation and movement/braking, not every coupling method. Stations, timetables, save/load and multiplayer remain unverified.</w:t>
+        <w:t>Final production architecture and successful station/timetable operation remain unresolved. Save/load and multiplayer are unverified; no Open Question is resolved by this diagnostic.</w:t>
       </w:r>
     </w:p>
     <w:p>
@@ -1733,7 +1733,7 @@
                 <w:b w:val="0"/>
                 <w:sz w:val="21"/>
               </w:rPr>
-              <w:t>Probe 1, traction controls and normal vanilla wagon consist integration verified; station/timetable tests next; final architecture unresolved</w:t>
+              <w:t>Probe 1 integration and Probe 2a power diagnostics complete; Probe 2b exact self-driving power-gate isolation next; final architecture unresolved</w:t>
             </w:r>
           </w:p>
         </w:tc>
@@ -2766,7 +2766,7 @@
       <w:jc w:val="right"/>
     </w:pPr>
     <w:r>
-      <w:t xml:space="preserve">2 October 2026  •  Page </w:t>
+      <w:t xml:space="preserve">3 October 2026  •  Page </w:t>
     </w:r>
     <w:fldSimple w:instr="PAGE"/>
   </w:p>

</xml_diff>